<commit_message>
Fix stale statements about detectors/fine-tuning in design and introduction; regenerate Word manuscript
Co-Authored-By: Claude Sonnet 5.5 <noreply@anthropic.com>
Claude-Session: https://claude.ai/code/session_017MNRAf9UiYS88emcavsz6Q
</commit_message>
<xml_diff>
--- a/paper/Manuscript_clean.docx
+++ b/paper/Manuscript_clean.docx
@@ -676,7 +676,7 @@
         <w:t xml:space="preserve"> </w:t>
       </w:r>
       <w:r>
-        <w:t xml:space="preserve">Because the study had to be completed on CPU-only infrastructure, the main detectors are TF-IDF/gradient-boosting models, complemented by a subsample experiment with frozen and fine-tuned CodeBERT (Section 5.6). The triage layer is detector-agnostic and the theoretical conclusions do not depend on the scorer, but the numerical levels (for example the achievable SAR) will differ for stronger models; Section 7 discusses this.</w:t>
+        <w:t xml:space="preserve">The main experiments were designed to run on CPUs, so the detectors on the full corpora are TF-IDF/gradient-boosting models; they are complemented by a subsample experiment with frozen and fine-tuned CodeBERT (Section 5.6), while larger code models and large language models were not evaluated. The triage layer is detector-agnostic and the theoretical conclusions do not depend on the scorer, but the numerical levels (for example the achievable SAR) will differ for stronger models; Section 7 discusses this.</w:t>
       </w:r>
     </w:p>
     <w:p>
@@ -14157,7 +14157,7 @@
         <w:pStyle w:val="FirstParagraph"/>
       </w:pPr>
       <w:r>
-        <w:t xml:space="preserve">Because the experiments must be fully reproducible on commodity CPUs and over 20 scenario–seed pairs, we use four lightweight, widely used detectors on the full corpora, complemented by CodeBERT experiments (frozen and fine-tuned) on a subsample (Section 4.5); the absence of fine-tuned code models is a limitation discussed in Section 7, and the triage layer is detector-agnostic.</w:t>
+        <w:t xml:space="preserve">Because the main experiments cover more than 40 scenario–seed pairs and must be reproducible on commodity CPUs, we use four lightweight, widely used detectors on the full corpora. They are complemented by CodeBERT experiments on a 30 000-function subsample: frozen embeddings (CPU) and end-to-end fine-tuning (one GPU, one or two seeds; Section 4.5). Larger code models and large language models were not evaluated, which is a limitation discussed in Section 7; the triage layer itself is detector-agnostic.</w:t>
       </w:r>
     </w:p>
     <w:p>

</xml_diff>

<commit_message>
Fix stale and inconsistent statements found by manuscript-wide audit; regenerate figures, tables and Word manuscript
- two-corpus/seven-scenario/five-RQ framing in the introduction updated to three corpora, 14 scenarios, eight RQs
- stale 'future work'/'limitation' statements about online adaptation and fine-tuning removed
- overclaims softened (shift always violates, weighting never helps, delayed feedback alone, formatting shortcut in PrimeVul)
- leakage table now includes the LR+LGBM rows cited in the text; figures regenerated with the LR+LGBM scorer
- positives per scenario, scorer naming, definition of 'valid', weight clipping, data-availability statement corrected

Co-Authored-By: Claude Sonnet 5.5 <noreply@anthropic.com>
Claude-Session: https://claude.ai/code/session_017MNRAf9UiYS88emcavsz6Q
</commit_message>
<xml_diff>
--- a/paper/Manuscript_clean.docx
+++ b/paper/Manuscript_clean.docx
@@ -112,7 +112,7 @@
         <w:t xml:space="preserve"> </w:t>
       </w:r>
       <w:r>
-        <w:t xml:space="preserve">We specialise conformal risk control to the clearance decision (finite-sample miss-rate guarantee, a high-probability variant, group-conditional calibration, a bound on the effect of distribution shift, an online variant with a deterministic guarantee under delayed feedback, certified flagging, and a cost-optimal budget) and evaluate it on three corpora (DiverseVul, Big-Vul, PrimeVul; 710 000 deduplicated C/C++ functions) in 14 scenarios and three seeds, with four detectors, frozen and fine-tuned CodeBERT scorers and a rule-based analyser.</w:t>
+        <w:t xml:space="preserve">We specialise conformal risk control to the clearance decision (finite-sample miss-rate guarantee, a high-probability variant, group-conditional calibration, a bound on the effect of distribution shift, an online variant with a deterministic guarantee under delayed feedback, certified flagging, and a cost-optimal budget) and evaluate it on three corpora (DiverseVul, Big-Vul, PrimeVul; 710 000 deduplicated C/C++ functions) in 14 scenarios and three seeds, with four lightweight detectors on the full corpora, frozen and (for one or two seeds) fine-tuned CodeBERT scorers on a 30 000-function subsample of DiverseVul and Big-Vul, and a rule-based analyser.</w:t>
       </w:r>
     </w:p>
     <w:p>
@@ -130,7 +130,7 @@
         <w:t xml:space="preserve"> </w:t>
       </w:r>
       <w:r>
-        <w:t xml:space="preserve">Deduplication removes a quarter of Big-Vul; 43% of Big-Vul and 77% of PrimeVul also occur in DiverseVul, which inflates naive cross-dataset AUPRC by 3.5–5.6×. Detection quality falls by 43–72% outside the random split. On exchangeable data the guarantee holds (realised miss 9.3% and 10.7% for a 10% budget); under shift it is violated by 2.7× on average on DiverseVul and Big-Vul and by 2.0× on PrimeVul (up to 37%), covariate-shift weighting repairs it only in some scenarios, and about 100 labelled target positives repair it, at a safe automation rate of 27–32% instead of 54–55% on DiverseVul and Big-Vul (26–51% on PrimeVul). Adaptive conformal inference restores the long-run budget (10.0–11.5% versus 20–37% for a static rule) from delayed outcome feedback alone, with a deterministic bound. Miss rates are very uneven across function sizes (41% vs. 2%) and CWEs, and 13.5% of decisions flip under semantics-preserving rewrites. Frozen and fine-tuned CodeBERT scorers replicate the findings, and whitespace structure alone separates the classes with AUROC 0.89 in Big-Vul (0.84 in PrimeVul), so raw-text models look valid and efficient until the dataset changes (miss rates up to 48% at a 10% budget). Delegation pays off only when a miss costs tens of reviews.</w:t>
+        <w:t xml:space="preserve">Deduplication removes a quarter of Big-Vul; 43% of Big-Vul and 77% of PrimeVul also occur in DiverseVul, which inflates naive cross-dataset AUPRC by 3.5–5.6×. On DiverseVul and Big-Vul, detection quality (AUPRC of the LR+LGBM scorer) falls by 43–72% outside the random split. On exchangeable data the guarantee holds (realised miss 10.1% and 8.6% on DiverseVul and Big-Vul and 10.7% on PrimeVul for a 10% budget); under shift it is violated by 2.7× on average on DiverseVul and Big-Vul and by 2.0× on PrimeVul (up to 37%), covariate-shift weighting repairs it only in some scenarios, and about 100 labelled target positives repair it, at a safe automation rate of 27–32% instead of 54–55% on DiverseVul and Big-Vul (26–51% on PrimeVul). Adaptive conformal inference restores the long-run budget (10.0–11.5% versus 20–37% for a static rule) when the outcome of every vulnerable function is revealed after each batch, with a deterministic bound. Miss rates are very uneven across function sizes (41% vs. 2%) and CWEs, and 13.5% of decisions flip under semantics-preserving rewrites (random splits). Frozen and fine-tuned CodeBERT scorers replicate the findings, and whitespace structure alone separates the classes with AUROC 0.89 in Big-Vul (0.84 in PrimeVul, where function size alone already reaches 0.81), so raw-text models look valid and efficient until the dataset changes (miss rates up to 48% at a 10% budget). Delegation pays off only when a miss costs tens of reviews.</w:t>
       </w:r>
     </w:p>
     <w:p>
@@ -380,7 +380,7 @@
         <w:t xml:space="preserve"> </w:t>
       </w:r>
       <w:r>
-        <w:t xml:space="preserve">We test the construction on 487 412 deduplicated C/C++ functions from two public corpora (DiverseVul and Big-Vul), in seven evaluation scenarios (random, project-disjoint, temporal, cross-dataset), with three seeds and four detectors, together with a rule-based analyser. The guarantee is exact on exchangeable data and fails under every kind of shift we examine, by a factor of 2.7 on average (2.0 on a third corpus, PrimeVul); the standard remedy of covariate-shift weighting repairs it only in some scenarios; a small number of labelled target positives (about 100) does; and adaptive conformal inference keeps the long-run budget along a drifting stream from delayed outcome feedback alone. What can then be automated is about half of what a random-split evaluation suggests. The same holds for scorers built on a pre-trained code model (CodeBERT), and in checking this we found that models reading raw Big-Vul text exploit a formatting shortcut that gives them an apparently valid and efficient filter that fails on other data.</w:t>
+        <w:t xml:space="preserve">We test the construction on 709 970 deduplicated C/C++ functions from three public corpora (DiverseVul, Big-Vul and PrimeVul), in 14 evaluation scenarios (seven per design: random, project-disjoint, temporal and four cross-dataset; PrimeVul repeats the design of the first two corpora), with three seeds and four lightweight detectors, plus frozen and fine-tuned CodeBERT scorers on a subsample and a rule-based analyser. The guarantee holds on exchangeable data and is violated under most of the shifts we examine, by a factor of 2.7 on average on DiverseVul and Big-Vul and 2.0 on PrimeVul, with the size of the violation depending on the corpus and the split (from near nominal to 3.7 times the budget); the standard remedy of covariate-shift weighting repairs it only in some scenarios; a small number of labelled target positives (about 100) does; and adaptive conformal inference keeps the long-run budget along a drifting stream when outcomes of every vulnerable function are revealed after each batch. What can then be automated is about half of what a random-split evaluation suggests. The same holds for scorers built on a pre-trained code model (CodeBERT), and in checking this we found that models reading raw Big-Vul text exploit a formatting shortcut that gives them an apparently valid and efficient filter that fails on other data.</w:t>
       </w:r>
     </w:p>
     <w:p>
@@ -526,7 +526,7 @@
         <w:t xml:space="preserve"> </w:t>
       </w:r>
       <w:r>
-        <w:t xml:space="preserve">on seven scenarios, including evidence that source-calibrated clearance misses 2.7× the nominal share under shift, that all 336 observations satisfy the proposed bound, that covariate-shift weighting is insufficient, and how many labelled target positives are needed to recover validity.</w:t>
+        <w:t xml:space="preserve">on 14 scenarios over three corpora, including evidence that source-calibrated clearance misses 2.7× (DiverseVul, Big-Vul) and 2.0× (PrimeVul) the nominal share under shift on average, that all 336 observations of the main study (and all 336 on PrimeVul) satisfy the proposed bound, that covariate-shift weighting repairs the violation only in some scenarios, and how many labelled target positives are needed to recover validity.</w:t>
       </w:r>
     </w:p>
     <w:p>
@@ -637,7 +637,7 @@
         <w:t xml:space="preserve">A pre-trained-model replication and shortcut audit</w:t>
       </w:r>
       <w:r>
-        <w:t xml:space="preserve">: frozen CodeBERT scorers on raw and normalised text, fine-tuned CodeBERT, a formatting probe in which whitespace structure alone reaches AUROC 0.89 on Big-Vul and 0.84 on PrimeVul, and the demonstration that a conformal guarantee can hold for a scorer that relies on such a shortcut.</w:t>
+        <w:t xml:space="preserve">: frozen CodeBERT scorers on raw and normalised text, fine-tuned CodeBERT, a formatting probe in which whitespace structure alone reaches AUROC 0.89 on Big-Vul (and 0.84 on PrimeVul, where size alone already reaches 0.81), and the demonstration that a conformal guarantee can hold for a scorer that relies on such a shortcut.</w:t>
       </w:r>
     </w:p>
     <w:p>
@@ -694,7 +694,7 @@
         <w:t xml:space="preserve"> </w:t>
       </w:r>
       <w:r>
-        <w:t xml:space="preserve">Section 2 places the work in the literature, Section 3 develops the theory, Section 4 describes the study, Section 5 answers the five research questions, and Sections 6–8 discuss implications, threats and conclusions.</w:t>
+        <w:t xml:space="preserve">Section 2 places the work in the literature, Section 3 develops the theory, Section 4 describes the study, Section 5 answers the eight research questions, and Sections 6–8 discuss implications, threats and conclusions.</w:t>
       </w:r>
     </w:p>
     <w:bookmarkEnd w:id="13"/>
@@ -853,7 +853,7 @@
         <w:t xml:space="preserve"> </w:t>
       </w:r>
       <w:r>
-        <w:t xml:space="preserve">shortcut (whitespace structure alone reaches AUROC 0.89 in the Big-Vul release we used, and 0.84 in PrimeVul), which is different from the identifier-level spurious features studied before. To our knowledge none of the cited studies reports such pairwise overlaps or a formatting-only probe.</w:t>
+        <w:t xml:space="preserve">shortcut (whitespace structure alone reaches AUROC 0.89 in the Big-Vul release we used, and 0.84 in PrimeVul, where function size alone already reaches 0.81), which is different from the identifier-level spurious features studied before. To our knowledge none of the cited studies reports the exact pairwise overlaps among these three corpora (PrimeVul being partly derived from earlier corpora, a large overlap is in part by construction) or a formatting-only probe.</w:t>
       </w:r>
     </w:p>
     <w:p>
@@ -7651,7 +7651,39 @@
         <w:t xml:space="preserve"> </w:t>
       </w:r>
       <w:r>
-        <w:t xml:space="preserve">with a cross-fitted logistic domain classifier on TF-IDF features. The guarantee is only as good as the density-ratio estimate and the covariate-shift assumption, both of which are doubtful for code; we therefore treat it as an empirical question (RQ3).</w:t>
+        <w:t xml:space="preserve">with a cross-fitted logistic domain classifier on TF-IDF features, with weights clipped to</w:t>
+      </w:r>
+      <w:r>
+        <w:t xml:space="preserve"> </w:t>
+      </w:r>
+      <m:oMath>
+        <m:r>
+          <m:rPr>
+            <m:sty m:val="p"/>
+          </m:rPr>
+          <m:t>[</m:t>
+        </m:r>
+        <m:r>
+          <m:t>0.05</m:t>
+        </m:r>
+        <m:r>
+          <m:rPr>
+            <m:sty m:val="p"/>
+          </m:rPr>
+          <m:t>,</m:t>
+        </m:r>
+        <m:r>
+          <m:t>20</m:t>
+        </m:r>
+        <m:r>
+          <m:rPr>
+            <m:sty m:val="p"/>
+          </m:rPr>
+          <m:t>]</m:t>
+        </m:r>
+      </m:oMath>
+      <w:r>
+        <w:t xml:space="preserve">. The guarantee is only as good as the density-ratio estimate and the covariate-shift assumption, both of which are doubtful for code; we therefore treat it as an empirical question (RQ3).</w:t>
       </w:r>
     </w:p>
     <w:p>
@@ -7809,7 +7841,7 @@
         <w:pStyle w:val="FirstParagraph"/>
       </w:pPr>
       <w:r>
-        <w:t xml:space="preserve">Recalibration on a labelled target sample (Section above) is a one-off remedy. In deployment the distribution keeps moving (new releases, new projects) and labels arrive over time: a vulnerable function that was cleared may be discovered later (an incident, a disclosure, an audit of the cleared pool). We therefore also consider a stream of functions processed in batches</w:t>
+        <w:t xml:space="preserve">Recalibration on a labelled target sample (previous subsection) is a one-off remedy. In deployment the distribution keeps moving (new releases, new projects) and labels arrive over time: a vulnerable function that was cleared may be discovered later (an incident, a disclosure, an audit of the cleared pool). We therefore also consider a stream of functions processed in batches</w:t>
       </w:r>
       <w:r>
         <w:t xml:space="preserve"> </w:t>
@@ -14157,7 +14189,7 @@
         <w:pStyle w:val="FirstParagraph"/>
       </w:pPr>
       <w:r>
-        <w:t xml:space="preserve">Because the main experiments cover more than 40 scenario–seed pairs and must be reproducible on commodity CPUs, we use four lightweight, widely used detectors on the full corpora. They are complemented by CodeBERT experiments on a 30 000-function subsample: frozen embeddings (CPU) and end-to-end fine-tuning (one GPU, one or two seeds; Section 4.5). Larger code models and large language models were not evaluated, which is a limitation discussed in Section 7; the triage layer itself is detector-agnostic.</w:t>
+        <w:t xml:space="preserve">Because the main experiments cover 21 scenario–seed pairs (42 with PrimeVul) and must be reproducible on commodity CPUs, we use four lightweight, widely used detectors on the full corpora. They are complemented by CodeBERT experiments on a 30 000-function subsample: frozen embeddings (CPU) and end-to-end fine-tuning (one GPU, one or two seeds; Section 4.5). Larger code models and large language models were not evaluated, which is a limitation discussed in Section 7; the triage layer itself is detector-agnostic.</w:t>
       </w:r>
     </w:p>
     <w:p>
@@ -14383,7 +14415,16 @@
         <w:t xml:space="preserve">“CodeBERT ensemble”</w:t>
       </w:r>
       <w:r>
-        <w:t xml:space="preserve">. Embedding the full corpora (487 000 functions) is infeasible on CPU, so we use a stratified subsample of each corpus with all scenarios, splits and seeds unchanged: 5 000 vulnerable and 10 000 benign functions per dataset (30 000 in total; the benign functions are a uniform sample, so positive-class quantities such as the miss rate are unaffected, while AUPRC and SAR are weighted back to the true prevalence). All scorers in this experiment, including the TF-IDF models, are retrained on the subsample so that comparisons are matched.</w:t>
+        <w:t xml:space="preserve">. Embedding the full corpora (487 000 functions) is infeasible on CPU, so we use a stratified subsample of each corpus with all scenarios, splits and seeds unchanged: 5 000 vulnerable and 10 000 benign functions per dataset (30 000 in total; the benign functions are a uniform sample, so positive-class quantities such as the miss rate are unaffected, while AUPRC and SAR are weighted back to the true prevalence). All scorers in this experiment, including the TF-IDF models, are retrained on the subsample so that comparisons are matched; the lexical reference scorer of this experiment (</w:t>
+      </w:r>
+      <w:r>
+        <w:t xml:space="preserve">“TF-IDF+LGBM”</w:t>
+      </w:r>
+      <w:r>
+        <w:t xml:space="preserve"> </w:t>
+      </w:r>
+      <w:r>
+        <w:t xml:space="preserve">in the tables) is the LR+LGBM ensemble of the main study retrained on the subsample.</w:t>
       </w:r>
       <w:r>
         <w:t xml:space="preserve"> </w:t>
@@ -14446,7 +14487,7 @@
         <w:t xml:space="preserve"> </w:t>
       </w:r>
       <w:r>
-        <w:t xml:space="preserve">Two input variants are evaluated:</w:t>
+        <w:t xml:space="preserve">Two input variants are evaluated for the frozen encoder:</w:t>
       </w:r>
       <w:r>
         <w:t xml:space="preserve"> </w:t>
@@ -14475,7 +14516,7 @@
         <w:t xml:space="preserve"> </w:t>
       </w:r>
       <w:r>
-        <w:t xml:space="preserve">(comments removed, whitespace collapsed), the same normalisation used in the main study. A</w:t>
+        <w:t xml:space="preserve">(comments removed, whitespace collapsed), the same normalisation used in the main study; the fine-tuned model uses normalised text only. A</w:t>
       </w:r>
       <w:r>
         <w:t xml:space="preserve"> </w:t>
@@ -14945,7 +14986,23 @@
         <w:t xml:space="preserve"> </w:t>
       </w:r>
       <w:r>
-        <w:t xml:space="preserve">realised miss rate</w:t>
+        <w:t xml:space="preserve">(a rule is called</w:t>
+      </w:r>
+      <w:r>
+        <w:t xml:space="preserve"> </w:t>
+      </w:r>
+      <w:r>
+        <w:rPr>
+          <w:i/>
+          <w:iCs/>
+        </w:rPr>
+        <w:t xml:space="preserve">valid</w:t>
+      </w:r>
+      <w:r>
+        <w:t xml:space="preserve"> </w:t>
+      </w:r>
+      <w:r>
+        <w:t xml:space="preserve">in a scenario when its realised miss rate does not exceed α by more than two percentage points; Proposition 1 itself guarantees only the expectation) realised miss rate</w:t>
       </w:r>
       <w:r>
         <w:t xml:space="preserve"> </w:t>
@@ -16014,7 +16071,7 @@
                 <w:rFonts w:ascii="Times New Roman" w:hAnsi="Times New Roman"/>
                 <w:sz w:val="16"/>
               </w:rPr>
-              <w:t xml:space="preserve">BV→DV</w:t>
+              <w:t xml:space="preserve">DV→BV</w:t>
             </w:r>
           </w:p>
         </w:tc>
@@ -16036,7 +16093,7 @@
                 <w:rFonts w:ascii="Times New Roman" w:hAnsi="Times New Roman"/>
                 <w:sz w:val="16"/>
               </w:rPr>
-              <w:t xml:space="preserve">TF-IDF LR</w:t>
+              <w:t xml:space="preserve">LR+LGBM</w:t>
             </w:r>
           </w:p>
         </w:tc>
@@ -16058,7 +16115,7 @@
                 <w:rFonts w:ascii="Times New Roman" w:hAnsi="Times New Roman"/>
                 <w:sz w:val="16"/>
               </w:rPr>
-              <w:t xml:space="preserve">44,120</w:t>
+              <w:t xml:space="preserve">44,180</w:t>
             </w:r>
           </w:p>
         </w:tc>
@@ -16080,7 +16137,7 @@
                 <w:rFonts w:ascii="Times New Roman" w:hAnsi="Times New Roman"/>
                 <w:sz w:val="16"/>
               </w:rPr>
-              <w:t xml:space="preserve">0.137 </w:t>
+              <w:t xml:space="preserve">0.171 </w:t>
             </w:r>
             <w:r>
               <w:rPr>
@@ -16109,14 +16166,14 @@
                 <w:rFonts w:ascii="Times New Roman" w:hAnsi="Times New Roman"/>
                 <w:sz w:val="16"/>
               </w:rPr>
-              <w:t xml:space="preserve">0.862 </w:t>
+              <w:t xml:space="preserve">0.602 </w:t>
             </w:r>
             <w:r>
               <w:rPr>
                 <w:rFonts w:ascii="Times New Roman" w:hAnsi="Times New Roman"/>
                 <w:sz w:val="16"/>
               </w:rPr>
-              <w:t xml:space="preserve">±0.005</w:t>
+              <w:t xml:space="preserve">±0.026</w:t>
             </w:r>
           </w:p>
         </w:tc>
@@ -16138,14 +16195,14 @@
                 <w:rFonts w:ascii="Times New Roman" w:hAnsi="Times New Roman"/>
                 <w:sz w:val="16"/>
               </w:rPr>
-              <w:t xml:space="preserve">0.711 </w:t>
+              <w:t xml:space="preserve">0.710 </w:t>
             </w:r>
             <w:r>
               <w:rPr>
                 <w:rFonts w:ascii="Times New Roman" w:hAnsi="Times New Roman"/>
                 <w:sz w:val="16"/>
               </w:rPr>
-              <w:t xml:space="preserve">±0.001</w:t>
+              <w:t xml:space="preserve">±0.002</w:t>
             </w:r>
           </w:p>
         </w:tc>
@@ -16167,14 +16224,14 @@
                 <w:rFonts w:ascii="Times New Roman" w:hAnsi="Times New Roman"/>
                 <w:sz w:val="16"/>
               </w:rPr>
-              <w:t xml:space="preserve">0.951 </w:t>
+              <w:t xml:space="preserve">0.969 </w:t>
             </w:r>
             <w:r>
               <w:rPr>
                 <w:rFonts w:ascii="Times New Roman" w:hAnsi="Times New Roman"/>
                 <w:sz w:val="16"/>
               </w:rPr>
-              <w:t xml:space="preserve">±0.003</w:t>
+              <w:t xml:space="preserve">±0.002</w:t>
             </w:r>
           </w:p>
         </w:tc>
@@ -16220,6 +16277,190 @@
                 <w:rFonts w:ascii="Times New Roman" w:hAnsi="Times New Roman"/>
                 <w:sz w:val="16"/>
               </w:rPr>
+              <w:t xml:space="preserve">TF-IDF LR</w:t>
+            </w:r>
+          </w:p>
+        </w:tc>
+        <w:tc>
+          <w:tcPr>
+            <w:tcMar>
+              <w:left w:w="40" w:type="dxa"/>
+              <w:right w:w="40" w:type="dxa"/>
+            </w:tcMar>
+          </w:tcPr>
+          <w:p>
+            <w:pPr>
+              <w:pStyle w:val="Compact"/>
+              <w:spacing w:after="0" w:before="0" w:line="240" w:lineRule="auto"/>
+              <w:jc w:val="center"/>
+            </w:pPr>
+            <w:r>
+              <w:rPr>
+                <w:rFonts w:ascii="Times New Roman" w:hAnsi="Times New Roman"/>
+                <w:sz w:val="16"/>
+              </w:rPr>
+              <w:t xml:space="preserve">44,120</w:t>
+            </w:r>
+          </w:p>
+        </w:tc>
+        <w:tc>
+          <w:tcPr>
+            <w:tcMar>
+              <w:left w:w="40" w:type="dxa"/>
+              <w:right w:w="40" w:type="dxa"/>
+            </w:tcMar>
+          </w:tcPr>
+          <w:p>
+            <w:pPr>
+              <w:pStyle w:val="Compact"/>
+              <w:spacing w:after="0" w:before="0" w:line="240" w:lineRule="auto"/>
+              <w:jc w:val="center"/>
+            </w:pPr>
+            <w:r>
+              <w:rPr>
+                <w:rFonts w:ascii="Times New Roman" w:hAnsi="Times New Roman"/>
+                <w:sz w:val="16"/>
+              </w:rPr>
+              <w:t xml:space="preserve">0.137 </w:t>
+            </w:r>
+            <w:r>
+              <w:rPr>
+                <w:rFonts w:ascii="Times New Roman" w:hAnsi="Times New Roman"/>
+                <w:sz w:val="16"/>
+              </w:rPr>
+              <w:t xml:space="preserve">±0.001</w:t>
+            </w:r>
+          </w:p>
+        </w:tc>
+        <w:tc>
+          <w:tcPr>
+            <w:tcMar>
+              <w:left w:w="40" w:type="dxa"/>
+              <w:right w:w="40" w:type="dxa"/>
+            </w:tcMar>
+          </w:tcPr>
+          <w:p>
+            <w:pPr>
+              <w:pStyle w:val="Compact"/>
+              <w:spacing w:after="0" w:before="0" w:line="240" w:lineRule="auto"/>
+              <w:jc w:val="center"/>
+            </w:pPr>
+            <w:r>
+              <w:rPr>
+                <w:rFonts w:ascii="Times New Roman" w:hAnsi="Times New Roman"/>
+                <w:sz w:val="16"/>
+              </w:rPr>
+              <w:t xml:space="preserve">0.862 </w:t>
+            </w:r>
+            <w:r>
+              <w:rPr>
+                <w:rFonts w:ascii="Times New Roman" w:hAnsi="Times New Roman"/>
+                <w:sz w:val="16"/>
+              </w:rPr>
+              <w:t xml:space="preserve">±0.005</w:t>
+            </w:r>
+          </w:p>
+        </w:tc>
+        <w:tc>
+          <w:tcPr>
+            <w:tcMar>
+              <w:left w:w="40" w:type="dxa"/>
+              <w:right w:w="40" w:type="dxa"/>
+            </w:tcMar>
+          </w:tcPr>
+          <w:p>
+            <w:pPr>
+              <w:pStyle w:val="Compact"/>
+              <w:spacing w:after="0" w:before="0" w:line="240" w:lineRule="auto"/>
+              <w:jc w:val="center"/>
+            </w:pPr>
+            <w:r>
+              <w:rPr>
+                <w:rFonts w:ascii="Times New Roman" w:hAnsi="Times New Roman"/>
+                <w:sz w:val="16"/>
+              </w:rPr>
+              <w:t xml:space="preserve">0.711 </w:t>
+            </w:r>
+            <w:r>
+              <w:rPr>
+                <w:rFonts w:ascii="Times New Roman" w:hAnsi="Times New Roman"/>
+                <w:sz w:val="16"/>
+              </w:rPr>
+              <w:t xml:space="preserve">±0.001</w:t>
+            </w:r>
+          </w:p>
+        </w:tc>
+        <w:tc>
+          <w:tcPr>
+            <w:tcMar>
+              <w:left w:w="40" w:type="dxa"/>
+              <w:right w:w="40" w:type="dxa"/>
+            </w:tcMar>
+          </w:tcPr>
+          <w:p>
+            <w:pPr>
+              <w:pStyle w:val="Compact"/>
+              <w:spacing w:after="0" w:before="0" w:line="240" w:lineRule="auto"/>
+              <w:jc w:val="center"/>
+            </w:pPr>
+            <w:r>
+              <w:rPr>
+                <w:rFonts w:ascii="Times New Roman" w:hAnsi="Times New Roman"/>
+                <w:sz w:val="16"/>
+              </w:rPr>
+              <w:t xml:space="preserve">0.951 </w:t>
+            </w:r>
+            <w:r>
+              <w:rPr>
+                <w:rFonts w:ascii="Times New Roman" w:hAnsi="Times New Roman"/>
+                <w:sz w:val="16"/>
+              </w:rPr>
+              <w:t xml:space="preserve">±0.003</w:t>
+            </w:r>
+          </w:p>
+        </w:tc>
+      </w:tr>
+      <w:tr>
+        <w:tc>
+          <w:tcPr>
+            <w:tcMar>
+              <w:left w:w="40" w:type="dxa"/>
+              <w:right w:w="40" w:type="dxa"/>
+            </w:tcMar>
+          </w:tcPr>
+          <w:p>
+            <w:pPr>
+              <w:pStyle w:val="Compact"/>
+              <w:spacing w:after="0" w:before="0" w:line="240" w:lineRule="auto"/>
+              <w:jc w:val="center"/>
+            </w:pPr>
+            <w:r>
+              <w:rPr>
+                <w:rFonts w:ascii="Times New Roman" w:hAnsi="Times New Roman"/>
+                <w:sz w:val="16"/>
+              </w:rPr>
+              <w:t xml:space="preserve">BV→DV</w:t>
+            </w:r>
+          </w:p>
+        </w:tc>
+        <w:tc>
+          <w:tcPr>
+            <w:tcMar>
+              <w:left w:w="40" w:type="dxa"/>
+              <w:right w:w="40" w:type="dxa"/>
+            </w:tcMar>
+          </w:tcPr>
+          <w:p>
+            <w:pPr>
+              <w:pStyle w:val="Compact"/>
+              <w:spacing w:after="0" w:before="0" w:line="240" w:lineRule="auto"/>
+              <w:jc w:val="center"/>
+            </w:pPr>
+            <w:r>
+              <w:rPr>
+                <w:rFonts w:ascii="Times New Roman" w:hAnsi="Times New Roman"/>
+                <w:sz w:val="16"/>
+              </w:rPr>
               <w:t xml:space="preserve">LightGBM</w:t>
             </w:r>
           </w:p>
@@ -16359,6 +16600,190 @@
                 <w:sz w:val="16"/>
               </w:rPr>
               <w:t xml:space="preserve">±0.007</w:t>
+            </w:r>
+          </w:p>
+        </w:tc>
+      </w:tr>
+      <w:tr>
+        <w:tc>
+          <w:tcPr>
+            <w:tcMar>
+              <w:left w:w="40" w:type="dxa"/>
+              <w:right w:w="40" w:type="dxa"/>
+            </w:tcMar>
+          </w:tcPr>
+          <w:p>
+            <w:pPr>
+              <w:pStyle w:val="Compact"/>
+              <w:spacing w:after="0" w:before="0" w:line="240" w:lineRule="auto"/>
+              <w:jc w:val="center"/>
+            </w:pPr>
+            <w:r>
+              <w:rPr>
+                <w:rFonts w:ascii="Times New Roman" w:hAnsi="Times New Roman"/>
+                <w:sz w:val="16"/>
+              </w:rPr>
+              <w:t xml:space="preserve">BV→DV</w:t>
+            </w:r>
+          </w:p>
+        </w:tc>
+        <w:tc>
+          <w:tcPr>
+            <w:tcMar>
+              <w:left w:w="40" w:type="dxa"/>
+              <w:right w:w="40" w:type="dxa"/>
+            </w:tcMar>
+          </w:tcPr>
+          <w:p>
+            <w:pPr>
+              <w:pStyle w:val="Compact"/>
+              <w:spacing w:after="0" w:before="0" w:line="240" w:lineRule="auto"/>
+              <w:jc w:val="center"/>
+            </w:pPr>
+            <w:r>
+              <w:rPr>
+                <w:rFonts w:ascii="Times New Roman" w:hAnsi="Times New Roman"/>
+                <w:sz w:val="16"/>
+              </w:rPr>
+              <w:t xml:space="preserve">LR+LGBM</w:t>
+            </w:r>
+          </w:p>
+        </w:tc>
+        <w:tc>
+          <w:tcPr>
+            <w:tcMar>
+              <w:left w:w="40" w:type="dxa"/>
+              <w:right w:w="40" w:type="dxa"/>
+            </w:tcMar>
+          </w:tcPr>
+          <w:p>
+            <w:pPr>
+              <w:pStyle w:val="Compact"/>
+              <w:spacing w:after="0" w:before="0" w:line="240" w:lineRule="auto"/>
+              <w:jc w:val="center"/>
+            </w:pPr>
+            <w:r>
+              <w:rPr>
+                <w:rFonts w:ascii="Times New Roman" w:hAnsi="Times New Roman"/>
+                <w:sz w:val="16"/>
+              </w:rPr>
+              <w:t xml:space="preserve">44,120</w:t>
+            </w:r>
+          </w:p>
+        </w:tc>
+        <w:tc>
+          <w:tcPr>
+            <w:tcMar>
+              <w:left w:w="40" w:type="dxa"/>
+              <w:right w:w="40" w:type="dxa"/>
+            </w:tcMar>
+          </w:tcPr>
+          <w:p>
+            <w:pPr>
+              <w:pStyle w:val="Compact"/>
+              <w:spacing w:after="0" w:before="0" w:line="240" w:lineRule="auto"/>
+              <w:jc w:val="center"/>
+            </w:pPr>
+            <w:r>
+              <w:rPr>
+                <w:rFonts w:ascii="Times New Roman" w:hAnsi="Times New Roman"/>
+                <w:sz w:val="16"/>
+              </w:rPr>
+              <w:t xml:space="preserve">0.144 </w:t>
+            </w:r>
+            <w:r>
+              <w:rPr>
+                <w:rFonts w:ascii="Times New Roman" w:hAnsi="Times New Roman"/>
+                <w:sz w:val="16"/>
+              </w:rPr>
+              <w:t xml:space="preserve">±0.002</w:t>
+            </w:r>
+          </w:p>
+        </w:tc>
+        <w:tc>
+          <w:tcPr>
+            <w:tcMar>
+              <w:left w:w="40" w:type="dxa"/>
+              <w:right w:w="40" w:type="dxa"/>
+            </w:tcMar>
+          </w:tcPr>
+          <w:p>
+            <w:pPr>
+              <w:pStyle w:val="Compact"/>
+              <w:spacing w:after="0" w:before="0" w:line="240" w:lineRule="auto"/>
+              <w:jc w:val="center"/>
+            </w:pPr>
+            <w:r>
+              <w:rPr>
+                <w:rFonts w:ascii="Times New Roman" w:hAnsi="Times New Roman"/>
+                <w:sz w:val="16"/>
+              </w:rPr>
+              <w:t xml:space="preserve">0.812 </w:t>
+            </w:r>
+            <w:r>
+              <w:rPr>
+                <w:rFonts w:ascii="Times New Roman" w:hAnsi="Times New Roman"/>
+                <w:sz w:val="16"/>
+              </w:rPr>
+              <w:t xml:space="preserve">±0.007</w:t>
+            </w:r>
+          </w:p>
+        </w:tc>
+        <w:tc>
+          <w:tcPr>
+            <w:tcMar>
+              <w:left w:w="40" w:type="dxa"/>
+              <w:right w:w="40" w:type="dxa"/>
+            </w:tcMar>
+          </w:tcPr>
+          <w:p>
+            <w:pPr>
+              <w:pStyle w:val="Compact"/>
+              <w:spacing w:after="0" w:before="0" w:line="240" w:lineRule="auto"/>
+              <w:jc w:val="center"/>
+            </w:pPr>
+            <w:r>
+              <w:rPr>
+                <w:rFonts w:ascii="Times New Roman" w:hAnsi="Times New Roman"/>
+                <w:sz w:val="16"/>
+              </w:rPr>
+              <w:t xml:space="preserve">0.721 </w:t>
+            </w:r>
+            <w:r>
+              <w:rPr>
+                <w:rFonts w:ascii="Times New Roman" w:hAnsi="Times New Roman"/>
+                <w:sz w:val="16"/>
+              </w:rPr>
+              <w:t xml:space="preserve">±0.003</w:t>
+            </w:r>
+          </w:p>
+        </w:tc>
+        <w:tc>
+          <w:tcPr>
+            <w:tcMar>
+              <w:left w:w="40" w:type="dxa"/>
+              <w:right w:w="40" w:type="dxa"/>
+            </w:tcMar>
+          </w:tcPr>
+          <w:p>
+            <w:pPr>
+              <w:pStyle w:val="Compact"/>
+              <w:spacing w:after="0" w:before="0" w:line="240" w:lineRule="auto"/>
+              <w:jc w:val="center"/>
+            </w:pPr>
+            <w:r>
+              <w:rPr>
+                <w:rFonts w:ascii="Times New Roman" w:hAnsi="Times New Roman"/>
+                <w:sz w:val="16"/>
+              </w:rPr>
+              <w:t xml:space="preserve">0.948 </w:t>
+            </w:r>
+            <w:r>
+              <w:rPr>
+                <w:rFonts w:ascii="Times New Roman" w:hAnsi="Times New Roman"/>
+                <w:sz w:val="16"/>
+              </w:rPr>
+              <w:t xml:space="preserve">±0.002</w:t>
             </w:r>
           </w:p>
         </w:tc>
@@ -16379,7 +16804,7 @@
         <w:t xml:space="preserve"> </w:t>
       </w:r>
       <w:r>
-        <w:t xml:space="preserve">Table 4 and Figure 3 give the detection results. On random splits the best scorer reaches AUPRC 0.248 (DiverseVul) and 0.407 (Big-Vul), with AUROC 0.836 and 0.869. When whole projects are held out, AUPRC falls to 0.141 ( −43%) and 0.151 ( −63%); the temporal split on Big-Vul yields 0.113 ( −72%), and the leak-free cross-dataset settings give 0.171 and 0.144. These values are only two to three times the prevalence (≈5%), and MCC drops to 0.12–0.17 for the best model (Table 4, panel C), against 0.29 and 0.39 on random splits. The ID-calibration AUPRC (what a practitioner would see on a hold-out of the training distribution) is 0.24–0.43 in every scenario, so the optimism of in-distribution validation reaches 1.5–3.8× for project, temporal and cross-dataset deployment (0.264 vs. 0.141 for DiverseVul project, 0.425 vs. 0.113 for Big-Vul temporal).</w:t>
+        <w:t xml:space="preserve">Table 4 and Figure 3 give the detection results. On random splits the LR+LGBM scorer reaches AUPRC 0.248 (DiverseVul) and 0.407 (Big-Vul); the percentages below are drops of this scorer, with AUROC 0.836 and 0.869. When whole projects are held out, AUPRC falls to 0.141 ( −43%) and 0.151 ( −63%); the temporal split on Big-Vul yields 0.113 ( −72%), and the leak-free cross-dataset settings give 0.171 and 0.144. These values are only two to three times the prevalence (≈5%), and MCC drops to 0.12–0.17 for the best model (Table 4, panel C), against 0.29 and 0.39 on random splits. The ID-calibration AUPRC (what a practitioner would see on a hold-out of the training distribution) is 0.24–0.43 in every scenario, so the optimism of in-distribution validation reaches 1.5–3.8× for project, temporal and cross-dataset deployment (0.264 vs. 0.141 for DiverseVul project, 0.425 vs. 0.113 for Big-Vul temporal).</w:t>
       </w:r>
       <w:r>
         <w:t xml:space="preserve"> </w:t>
@@ -19924,7 +20349,7 @@
         <w:t xml:space="preserve"> </w:t>
       </w:r>
       <w:r>
-        <w:t xml:space="preserve">While preparing the pre-trained-model experiment (Section 5.6) we found that the raw text of the Hugging Face release of Big-Vul carries a strong formatting signal: a classifier that sees only 15 formatting statistics (indentation, trailing whitespace, comment markers, line lengths; Table 16) reaches AUROC 0.919 on a random split, higher than every semantic model in this paper, and whitespace structure alone (tabs, leading and trailing whitespace, indentation, brace placement) reaches 0.892 against 0.687 for size alone (Table 22). The signal is present in PrimeVul as well (whitespace structure alone 0.841) but not in DiverseVul, where size dominates (0.719 for size alone, 0.682 for whitespace). All detectors in Sections 5.1–5.5 operate on comment-stripped, whitespace-insensitive tokens and code metrics, and removing the only size-sensitive metrics (characters, lines, tokens) changes the AUROC of the LightGBM scorer by at most 0.006 (0.820→0.818 on Big-Vul, 0.801→0.802 on DiverseVul, 0.820→0.814 on PrimeVul), so the main results are not driven by it (the same holds on PrimeVul, Section 5.8); but results obtained by models that read raw Big-Vul text should be interpreted with this in mind.</w:t>
+        <w:t xml:space="preserve">While preparing the pre-trained-model experiment (Section 5.6) we found that the raw text of the Hugging Face release of Big-Vul carries a strong formatting signal: a classifier that sees only 15 formatting statistics (indentation, trailing whitespace, comment markers, line lengths; Table 16) reaches AUROC 0.919 on a random split, higher than every semantic model in this paper (the raw-text CodeBERT ensemble of Section 5.6, which also sees the formatting, comes close at 0.893), and whitespace structure alone (tabs, leading and trailing whitespace, indentation, brace placement) reaches 0.892 against 0.687 for size alone (Table 22). The signal is present in PrimeVul as well (whitespace structure alone 0.841) but not in DiverseVul, where size dominates (0.719 for size alone, 0.682 for whitespace). All detectors in Sections 5.1–5.5 operate on comment-stripped, whitespace-insensitive tokens and code metrics, and removing the only size-sensitive metrics (characters, lines, tokens) changes the AUROC of the LightGBM scorer by at most 0.006 (0.820→0.818 on Big-Vul, 0.801→0.802 on DiverseVul, 0.820→0.814 on PrimeVul), so the main results are not driven by it (the same holds on PrimeVul, Section 5.8); but results obtained by models that read raw Big-Vul text should be interpreted with this in mind.</w:t>
       </w:r>
     </w:p>
     <w:bookmarkEnd w:id="41"/>
@@ -19951,7 +20376,7 @@
         <w:pStyle w:val="FirstParagraph"/>
       </w:pPr>
       <w:r>
-        <w:t xml:space="preserve">Table 5 reports ECE. Raw probabilities are mildly miscalibrated even on random splits (LR: 0.015–0.032; LightGBM: 0.0075–0.018), largely because training keeps at most 150 000 benign functions. Platt scaling and isotonic regression fitted on ID calibration data reduce ECE to 0.004–0.015 on random splits, but under shift the residual error is much larger: 0.015–0.023 for Big-Vul project, temporal and both cross-dataset settings, i.e. 30–46% of the 5% base rate, and the two methods perform alike. The one exception is LightGBM trained on DiverseVul and tested on Big-Vul, where raw probabilities (0.008) beat recalibrated ones (0.018). Importantly, because the clearance rule depends only on the ranking of scores, post-hoc calibration changes</w:t>
+        <w:t xml:space="preserve">Table 5 reports ECE. Raw probabilities are mildly miscalibrated even on random splits (LR: 0.015–0.032; LightGBM: 0.0075–0.018), largely because training keeps at most 150 000 benign functions. Platt scaling and isotonic regression fitted on ID calibration data reduce ECE to 0.004–0.015 on random splits, but under shift the residual error is much larger: 0.014–0.030 (LR and LightGBM, Platt scaling and isotonic regression) for the project, temporal and cross-dataset settings, i.e. roughly 30–60% of the 5% base rate, and the two methods perform alike. The one exception is LightGBM trained on DiverseVul and tested on Big-Vul, where raw probabilities (0.008) beat recalibrated ones (0.018). Importantly, because the clearance rule depends only on the ranking of scores, post-hoc calibration changes</w:t>
       </w:r>
       <w:r>
         <w:t xml:space="preserve"> </w:t>
@@ -21409,7 +21834,7 @@
         <w:rPr>
           <w:b w:val="0"/>
         </w:rPr>
-        <w:t xml:space="preserve"> Realised versus nominal miss rate for source-calibrated conformal clearance (LightGBM scorer; mean ± s.d. over seeds). The dashed line is the target.</w:t>
+        <w:t xml:space="preserve"> Realised versus nominal miss rate for source-calibrated conformal clearance (LR+LGBM scorer; mean ± s.d. over seeds). The dashed line is the target.</w:t>
       </w:r>
     </w:p>
     <w:p>
@@ -21462,7 +21887,7 @@
         </m:sSup>
       </m:oMath>
       <w:r>
-        <w:t xml:space="preserve">). At α=2% the miss rates are 5.0–10.7%. The severity of the project-level violation depends on which projects are held out: for Big-Vul project the realised miss rate at α=10% is 16.9, 32.0 and 23.0% in the three partitions (and 9.4, 17.7 and 3.0% in the three partitions of the subsample used in Section 5.6, where it can even fall below the nominal level), whereas the temporal and cross-dataset violations are stable across seeds (20.1–24.2%, 18.3–22.0%, and 36.7–37.2%). Project shift is thus a high-variance threat, temporal and dataset shift a consistent one. Meanwhile the SAR reported for the invalid rule is deceptively high (47.6–66.1%, Table 7), so a team calibrating on a convenient hold-out would believe the tool is both safe and efficient.</w:t>
+        <w:t xml:space="preserve">). At α=2% the miss rates are 5.0–10.7%. The severity of the project-level violation depends on which projects are held out: for Big-Vul project the realised miss rate at α=10% is 16.9, 32.0 and 23.0% in the three partitions (and 9.4, 17.7 and 3.0% in the three partitions of the subsample used in Section 5.6, for the normalised CodeBERT ensemble, where it can even fall below the nominal level), whereas the temporal and cross-dataset violations are stable across seeds (20.1–24.2%, 18.3–22.0%, and 36.7–37.2%). Project shift is thus a high-variance threat, temporal and dataset shift a consistent one. Meanwhile the SAR reported for the invalid rule is deceptively high (47.6–66.1%, Table 7), so a team calibrating on a convenient hold-out would believe the tool is both safe and efficient.</w:t>
       </w:r>
       <w:r>
         <w:t xml:space="preserve"> </w:t>
@@ -22719,7 +23144,7 @@
         <w:t xml:space="preserve"> </w:t>
       </w:r>
       <w:r>
-        <w:t xml:space="preserve">helps in two scenarios (DiverseVul project: 23.6→15.1%; DiverseVul→Big-Vul: 37.0→14.9%) but not in the other three (Big-Vul project 24.0→18.6%, Big-Vul temporal 21.7→22.6%, Big-Vul→DiverseVul 20.3→19.5%); it never restores the budget. The estimated weights are extremely skewed: the cap of 20 is reached for 22% of the Big-Vul test functions in DiverseVul→Big-Vul and for 15% in Big-Vul project (median test weight 5.5 and 5.4 against calibration weights around 0.2–0.3), so a few calibration positives carry most of the weight and the effective calibration size is small; together with a probably violated covariate-shift assumption for code, this explains why weighting is not a reliable repair.</w:t>
+        <w:t xml:space="preserve">helps in two scenarios (DiverseVul project: 23.6→15.1%; DiverseVul→Big-Vul: 37.0→14.9%) but not in the other three (Big-Vul project 24.0→18.6%, Big-Vul temporal 21.7→22.6%, Big-Vul→DiverseVul 20.3→19.5%); on these two corpora it never restores the budget. The estimated weights are extremely skewed: the cap of 20 is reached for 22% of the Big-Vul test functions in DiverseVul→Big-Vul and for 15% in Big-Vul project (median test weight 5.5 and 5.4 against calibration weights around 0.2–0.3), so a few calibration positives carry most of the weight and the effective calibration size is small; together with a probably violated covariate-shift assumption for code, this explains why weighting is not a reliable repair.</w:t>
       </w:r>
       <w:r>
         <w:t xml:space="preserve"> </w:t>
@@ -22818,7 +23243,20 @@
         <w:t xml:space="preserve"> </w:t>
       </w:r>
       <w:r>
-        <w:t xml:space="preserve">order statistics. The empirical curves fall inside the Beta band predicted by Corollary 1. Because the guarantee is in expectation, the frequency with which a single calibration draw exceeds α+2 points is 16–68% at</w:t>
+        <w:t xml:space="preserve">order statistics. The empirical curves fall inside the Beta band predicted by Corollary 1, except for Big-Vul project at</w:t>
+      </w:r>
+      <w:r>
+        <w:t xml:space="preserve"> </w:t>
+      </w:r>
+      <w:r>
+        <w:rPr>
+          <w:i/>
+          <w:iCs/>
+        </w:rPr>
+        <w:t xml:space="preserve">k</w:t>
+      </w:r>
+      <w:r>
+        <w:t xml:space="preserve">≥200, which stays slightly above it (13.4% against an upper band edge of about 12.6%), possibly because the projects of the target pool and of the test set differ. Because the guarantee is in expectation, the frequency with which a single calibration draw exceeds α+2 points is 16–68% at</w:t>
       </w:r>
       <w:r>
         <w:t xml:space="preserve"> </w:t>
@@ -22858,7 +23296,7 @@
       <w:r>
         <w:drawing>
           <wp:inline>
-            <wp:extent cx="5334000" cy="1297603"/>
+            <wp:extent cx="5334000" cy="1307379"/>
             <wp:effectExtent b="0" l="0" r="0" t="0"/>
             <wp:docPr descr="" title="" id="50" name="Picture"/>
             <a:graphic>
@@ -22879,7 +23317,7 @@
                   <pic:spPr bwMode="auto">
                     <a:xfrm>
                       <a:off x="0" y="0"/>
-                      <a:ext cx="5334000" cy="1297603"/>
+                      <a:ext cx="5334000" cy="1307379"/>
                     </a:xfrm>
                     <a:prstGeom prst="rect">
                       <a:avLst/>
@@ -22928,7 +23366,7 @@
         <w:t xml:space="preserve"> </w:t>
       </w:r>
       <w:r>
-        <w:t xml:space="preserve">of labelled target positives used for calibration (LightGBM scorer; mean over seeds). The shaded area is the 90% band of Corollary 1 for exchangeable data; dashed and dotted lines are the source-calibrated and weighted rules.</w:t>
+        <w:t xml:space="preserve">of labelled target positives used for calibration (LR+LGBM scorer; mean over seeds). The shaded area is the 90% band of Corollary 1 for exchangeable data; dashed and dotted lines are the source-calibrated and weighted rules.</w:t>
       </w:r>
     </w:p>
     <w:p>
@@ -25037,7 +25475,7 @@
         <w:t xml:space="preserve"> </w:t>
       </w:r>
       <w:r>
-        <w:t xml:space="preserve">Table 8 shows that the opposite decision, flagging with certified precision, offers little. With β=50% the Learn-then-Test procedure certifies a threshold that flags only 0.09% (DiverseVul) and 2.6% (Big-Vul) of the test functions on random splits (realised precision 80% and 57%); for β=70% the flagged share is below 0.3%. Under shift the certification fails as well: for β=50%, realised precision is 27% (Big-Vul project), 19% (Big-Vul temporal) and 23% (Big-Vul→DiverseVul), and the DiverseVul-trained detectors certify nothing. Learned detectors can</w:t>
+        <w:t xml:space="preserve">Table 8 shows that the opposite decision, flagging with certified precision, offers little. With β=50% the Learn-then-Test procedure certifies a threshold that flags only 0.09% (DiverseVul) and 2.6% (Big-Vul) of the test functions on random splits (realised precision 80% and 57%); for β=70% the flagged share is at most 0.3% on random splits. Under shift the certification fails as well: for β=50%, realised precision is 27% (Big-Vul project), 19% (Big-Vul temporal) and 23% (Big-Vul→DiverseVul), and the DiverseVul-trained detectors certify nothing. Learned detectors can</w:t>
       </w:r>
       <w:r>
         <w:t xml:space="preserve"> </w:t>
@@ -26501,7 +26939,7 @@
         <w:rPr>
           <w:b w:val="0"/>
         </w:rPr>
-        <w:t xml:space="preserve"> Miss rate per function-length tercile at α=10% on random splits, marginal versus Mondrian calibration (LR and LightGBM scorers, mean ± s.d.).</w:t>
+        <w:t xml:space="preserve"> Miss rate per function-length tercile at α=10% on random splits, marginal versus Mondrian calibration (LR+LGBM scorer, mean ± s.d.).</w:t>
       </w:r>
     </w:p>
     <w:p>
@@ -28282,7 +28720,7 @@
         <w:t xml:space="preserve"> </w:t>
       </w:r>
       <w:r>
-        <w:t xml:space="preserve">Table 10 and Figure 10 show how the clear/review decision changes when functions are rewritten without changing behaviour. Renaming local identifiers flips 10.4% of all decisions on average (and 5.6% of the vulnerable functions) and inserting dead code 6.0% (2.6%); both together flip 13.5% (6.7%). The score ranking is largely preserved (Spearman ρ=0.88–0.997) and AUROC drops only by about 0.02, but the miss rate moves from 8.6–11.3% (original) to up to 13.5% after renaming (LightGBM, DiverseVul), i.e. the nominal guarantee does not survive cosmetic changes to the inputs. Because the triage threshold sits in the dense part of the score distribution, small score changes translate into many decision flips, which matters for accountability: the same code can be cleared or sent to review depending on variable names.</w:t>
+        <w:t xml:space="preserve">Table 10 and Figure 10 show how the clear/review decision changes when functions are rewritten without changing behaviour. Renaming local identifiers flips 10.4% of all decisions on average (and 5.6% of the vulnerable functions) and inserting dead code 6.0% (2.6%); both together flip 13.5% (6.7%). The score ranking is largely preserved (Spearman ρ=0.88–0.997) and AUROC drops only by about 0.02, but the miss rate moves from 8.6–11.3% (original) to up to 13.5% after renaming (LightGBM, DiverseVul), i.e. the nominal budget can be exceeded after cosmetic changes to the inputs (by 2.3 points in the worst case, within about two points in the others). Because the triage threshold sits in the dense part of the score distribution, small score changes translate into many decision flips, which matters for accountability: the same code can be cleared or sent to review depending on variable names.</w:t>
       </w:r>
     </w:p>
     <w:p>
@@ -41535,7 +41973,7 @@
         <w:t xml:space="preserve"> </w:t>
       </w:r>
       <w:r>
-        <w:t xml:space="preserve">For every CodeBERT-based scorer the realised miss rate at α=10% is on target on random splits (CodeBERT ensemble 9.6% normalised, 10.0% raw; TF-IDF 9.2%; combined 9.5%) and exceeded under shift (averages over the five shifted scenarios: 14.3% normalised CodeBERT, 19.4% raw CodeBERT, 17.7% TF-IDF, 16.0% combined; Table 17), and all 504 (normalised) and 441 (raw) observations satisfy the KS bound of Proposition 3. Calibrating on 100 labelled target positives restores the budget for every scorer (mean miss 9.2–9.6%, range 7.5–10.1% over scenarios), and the PAC variant keeps the violation frequency at or below 1.3%. The excess under shift is smaller than in the main study (1.4–1.9× against 2.7×) because of the smaller training sets and, above all, because the project partitions of the subsample are milder (see Section 5.3); the cross-dataset violation remains large (22.7–30.4% for DiverseVul→Big-Vul).</w:t>
+        <w:t xml:space="preserve">For every CodeBERT-based scorer the realised miss rate at α=10% is on target on random splits (CodeBERT ensemble 9.6% normalised, 10.0% raw; TF-IDF 9.2%; combined 9.5%) and exceeded under shift (averages over the five shifted scenarios: 14.3% normalised CodeBERT, 19.4% raw CodeBERT, 17.7% TF-IDF, 16.0% combined; Table 17), and all 504 (normalised) and 441 (raw) observations satisfy the KS bound of Proposition 3. Calibrating on 100 labelled target positives restores the budget for every scorer (mean miss 9.1–9.6%, range 7.5–10.1% over scenarios), and the PAC variant keeps the violation frequency at or below 1.3%. The excess under shift is smaller than in the main study (1.4–1.9× against 2.7×) because of the smaller training sets and, above all, because the project partitions of the subsample are milder (see Section 5.3); the cross-dataset violation remains large (22.7–30.4% for DiverseVul→Big-Vul).</w:t>
       </w:r>
     </w:p>
     <w:p>
@@ -49319,7 +49757,7 @@
         <w:t xml:space="preserve"> </w:t>
       </w:r>
       <w:r>
-        <w:t xml:space="preserve">With the same detectors (Table 21), PrimeVul is the hardest corpus in absolute terms: AUROC 0.840 and AUPRC 0.139 on a random split (5.5× the prevalence), falling to 0.797 and 0.111 for held-out projects, 0.819 and 0.114 for later CVEs, and 0.715–0.826 across the cross-dataset scenarios.</w:t>
+        <w:t xml:space="preserve">With the same detectors (Table 21), PrimeVul is the hardest corpus in absolute terms: AUROC 0.840 and AUPRC 0.139 on a random split (5.5× the prevalence of 2.5%), falling to 0.797 and 0.111 for held-out projects, 0.819 and 0.114 for later CVEs, and 0.715–0.826 across the cross-dataset scenarios.</w:t>
       </w:r>
     </w:p>
     <w:p>
@@ -52243,7 +52681,7 @@
         <w:t xml:space="preserve"> </w:t>
       </w:r>
       <w:r>
-        <w:t xml:space="preserve">curve at fixed budgets on shift-aware splits, together with a leakage audit. AUROC correlated only weakly with the clearable share at α=5% (ρ=0.38) and the optimism of in-distribution validation reached a factor of 3.8 for AUPRC. The audit also shows that cross-dataset claims between these corpora must remove shared functions: otherwise the reported AUPRC is 3.5–5.6× too high. Finally, the mixed result for covariate-shift weighting is informative: weighting is the standard shift remedy in the conformal literature, but for source code it restored the budget in some scenarios (PrimeVul project and temporal, DiverseVul→PrimeVul) and not in others, and it never did so on DiverseVul and Big-Vul; its assumptions (a stable conditional</w:t>
+        <w:t xml:space="preserve">curve at fixed budgets on shift-aware splits, together with a leakage audit. AUROC correlated only weakly with the clearable share at α=5% (ρ=0.38) and the optimism of in-distribution validation reached a factor of 3.8 for AUPRC. The audit also shows that cross-dataset claims between these corpora must remove shared functions: otherwise the reported AUPRC is 3.5–5.6× too high. Finally, the mixed result for covariate-shift weighting is informative: weighting is the standard shift remedy in the conformal literature, but for source code it nearly restored the budget in some scenarios (PrimeVul project and temporal, DiverseVul→PrimeVul, within about two points) and not in others, and it never did so on DiverseVul and Big-Vul; its assumptions (a stable conditional</w:t>
       </w:r>
       <w:r>
         <w:t xml:space="preserve"> </w:t>
@@ -52302,7 +52740,7 @@
         <w:t xml:space="preserve"> </w:t>
       </w:r>
       <w:r>
-        <w:t xml:space="preserve">The special-issue themes of transparency, accountability and governance appear here as concrete, testable artefacts: the miss budget is an auditable statement ("at most α of the vulnerabilities in the calibration distribution are cleared"), its failure under shift is detectable once any labelled outcomes exist, the unevenness across sizes and CWEs shows where the statement hides risk, and the consistency study shows that the decision, not only the score, must be assessed under benign input changes. The approach transfers to other automated decisions in the development pipeline, e.g. filtering of software-composition-analysis alerts, triage of AI-generated code for review, or deciding which dependencies need manual vetting, wherever a rare, costly event is missed silently and labelled outcomes arrive over time.</w:t>
+        <w:t xml:space="preserve">The themes of transparency, accountability and governance of automated development tools appear here as concrete, testable artefacts: the miss budget is an auditable statement ("at most α of the vulnerabilities in the calibration distribution are cleared"), its failure under shift is detectable once any labelled outcomes exist, the unevenness across sizes and CWEs shows where the statement hides risk, and the consistency study shows that the decision, not only the score, must be assessed under benign input changes. The approach transfers to other automated decisions in the development pipeline, e.g. filtering of software-composition-analysis alerts, triage of AI-generated code for review, or deciding which dependencies need manual vetting, wherever a rare, costly event is missed silently and labelled outcomes arrive over time.</w:t>
       </w:r>
     </w:p>
     <w:p>
@@ -52320,7 +52758,7 @@
         <w:t xml:space="preserve"> </w:t>
       </w:r>
       <w:r>
-        <w:t xml:space="preserve">The size dependence found by the explanation analysis suggests that part of the predictive signal in these corpora is a size confound rather than vulnerability semantics, which is a data issue and not a triage issue, but it limits what any detector trained on them can deliver. Stronger detectors would raise the achievable automation but would not change the logic of Propositions 1 and 3. Online variants that adapt the threshold over time are a natural extension for drift that is gradual rather than abrupt.</w:t>
+        <w:t xml:space="preserve">The size dependence found by the explanation analysis suggests that part of the predictive signal in these corpora is a size confound rather than vulnerability semantics, which is a data issue and not a triage issue, but it limits what any detector trained on them can deliver. Stronger detectors would raise the achievable automation but would not change the logic of Propositions 1 and 3. Our online experiment replays arrival-ordered test sets with abrupt shifts (project switches, a change of dataset) and with gradual temporal drift on Big-Vul only, and assumes that every vulnerable function is labelled after its batch; drift in live systems, where only a fraction of cleared vulnerabilities is ever discovered, remains to be studied.</w:t>
       </w:r>
     </w:p>
     <w:bookmarkEnd w:id="89"/>
@@ -52421,7 +52859,7 @@
         <w:t xml:space="preserve"> </w:t>
       </w:r>
       <w:r>
-        <w:t xml:space="preserve">between nominal and realised miss rates, which does not depend on the absolute score. The realised miss rates are estimated on 600–2 600 vulnerable test functions per scenario, giving a sampling error of roughly one percentage point at α=10%; we use a two-point tolerance for violation counts and report standard deviations over three seeds. The conformal implementation is checked by a unit test against the</w:t>
+        <w:t xml:space="preserve">between nominal and realised miss rates, which does not depend on the absolute score. The realised miss rates are estimated on roughly 700–11 200 vulnerable test functions per scenario and seed in the main study (about 750 in the CodeBERT subsample), giving a sampling error of about one percentage point at α=10% in the smallest case; we use a two-point tolerance for violation counts and report standard deviations over three seeds. The conformal implementation is checked by a unit test against the</w:t>
       </w:r>
       <w:r>
         <w:t xml:space="preserve"> </w:t>
@@ -52434,13 +52872,13 @@
         <w:t xml:space="preserve">p</w:t>
       </w:r>
       <w:r>
-        <w:t xml:space="preserve">-value definition and by simulation of the finite-sample guarantee. The domain classifier behind the weighted variant is trained on the same features as the detector, and a better density-ratio estimator could do better, so the negative result for weighting should be read as</w:t>
-      </w:r>
-      <w:r>
-        <w:t xml:space="preserve"> </w:t>
-      </w:r>
-      <w:r>
-        <w:t xml:space="preserve">“not effective with standard estimators”</w:t>
+        <w:t xml:space="preserve">-value definition and by simulation of the finite-sample guarantee. The domain classifier behind the weighted variant is trained on the same features as the detector, and a better density-ratio estimator could do better, so the mixed result for weighting should be read as</w:t>
+      </w:r>
+      <w:r>
+        <w:t xml:space="preserve"> </w:t>
+      </w:r>
+      <w:r>
+        <w:t xml:space="preserve">“not reliably effective with standard estimators”</w:t>
       </w:r>
       <w:r>
         <w:t xml:space="preserve"> </w:t>
@@ -52455,7 +52893,7 @@
         <w:t xml:space="preserve">“never effective”</w:t>
       </w:r>
       <w:r>
-        <w:t xml:space="preserve">.</w:t>
+        <w:t xml:space="preserve">. The online experiment replays static test sets as streams with complete, delayed labels, uses a single scorer (LR+LGBM), and the step size was compared post hoc on the same streams, so it shows what the method can achieve when misses are discovered, not how fast they are discovered in practice.</w:t>
       </w:r>
     </w:p>
     <w:p>
@@ -52473,7 +52911,7 @@
         <w:t xml:space="preserve"> </w:t>
       </w:r>
       <w:r>
-        <w:t xml:space="preserve">We study three C/C++ corpora that share provenance (43% of Big-Vul and 77% of PrimeVul also occur in DiverseVul, Tables 1 and 20), so the cross-dataset scenarios are harder than a random split but not independent tests. Due to the CPU-only environment we evaluate four lightweight detectors on the full corpora, and CodeBERT, frozen and fine-tuned, only on a 30 000-function stratified subsample with the first 256 tokens (which truncates 34–44% of the normalised functions) and, for fine-tuning, on one or two seeds because the GPU quota ended; larger or newer code models and large language models were not evaluated and may reach higher AUROC, although fine-tuned CodeBERT did not outperform the lexical scorers here. We expect the logic of our findings to hold, as the CodeBERT experiment suggests, but the conformal guarantee depends on exchangeability and not on the scorer, and the</w:t>
+        <w:t xml:space="preserve">We study three C/C++ corpora that share provenance (43% of Big-Vul and 77% of PrimeVul also occur in DiverseVul, Tables 1 and 20), so the cross-dataset scenarios are harder than a random split but not independent tests. Because the main experiments were designed to run on CPUs, we evaluate four lightweight detectors on the full corpora, and CodeBERT, frozen and fine-tuned, only on a 30 000-function stratified subsample with the first 256 tokens (which truncates 34–44% of the normalised functions) and, for fine-tuning, on one or two seeds because the GPU quota ended; larger or newer code models and large language models were not evaluated and may reach higher AUROC, although fine-tuned CodeBERT did not outperform the lexical scorers here. We expect the logic of our findings to hold, as the CodeBERT experiment suggests, but the conformal guarantee depends on exchangeability and not on the scorer, and the</w:t>
       </w:r>
       <w:r>
         <w:t xml:space="preserve"> </w:t>
@@ -52483,13 +52921,13 @@
           <w:i/>
           <w:iCs/>
         </w:rPr>
-        <w:t xml:space="preserve">direction</w:t>
-      </w:r>
-      <w:r>
-        <w:t xml:space="preserve"> </w:t>
-      </w:r>
-      <w:r>
-        <w:t xml:space="preserve">of our findings under shift (guarantees that hold under exchangeability and break under shift) follows from Proposition 3. The</w:t>
+        <w:t xml:space="preserve">possibility</w:t>
+      </w:r>
+      <w:r>
+        <w:t xml:space="preserve"> </w:t>
+      </w:r>
+      <w:r>
+        <w:t xml:space="preserve">of a violation under shift follows from Proposition 3 (a diagnostic upper bound), while its size must be measured empirically, as the range from near-nominal to 3.7× the budget in our own scenarios shows. The</w:t>
       </w:r>
       <w:r>
         <w:t xml:space="preserve"> </w:t>
@@ -52513,7 +52951,7 @@
         <w:pStyle w:val="BodyText"/>
       </w:pPr>
       <w:r>
-        <w:t xml:space="preserve">The formatting shortcut we report was found in the Hugging Face release of Big-Vul used here; we did not trace whether it originates in the original data collection or in the release, and other releases may differ. The formatting-only probe is an upper-bound check, not an explanation of every model’s behaviour.</w:t>
+        <w:t xml:space="preserve">The formatting shortcut we report was found in the Hugging Face releases of Big-Vul (clearly) and PrimeVul (more weakly, as function size alone is nearly as informative there) used here; we did not trace whether it originates in the original data collection or in the release, and because many PrimeVul benign functions are patched twins of vulnerable ones, the differences may partly reflect how the fixes were applied. Other releases may differ. The formatting-only probe is an upper-bound check, not an explanation of every model’s behaviour.</w:t>
       </w:r>
     </w:p>
     <w:p>
@@ -52591,7 +53029,7 @@
         <w:pStyle w:val="FirstParagraph"/>
       </w:pPr>
       <w:r>
-        <w:t xml:space="preserve">We asked when an automated vulnerability detector can be trusted to clear code. Framing clearance as risk control gives a precise answer: it can be trusted to the extent that the miss rate was calibrated on data that resembles the code it will see. On exchangeable splits conformal clearance delivers its guarantee on real detector scores, clearing 54–55% of functions at a 10% miss budget. Under project, temporal and cross-dataset shift the same procedure misses 2.7× the nominal share on average, covariate-shift weighting does not repair it, and about 100 labelled target positives do, at roughly half of the automation; adaptive conformal inference achieves the same long-run control on drifting streams from delayed feedback alone. The guarantee is also uneven across function sizes and vulnerability classes, sensitive to cosmetic code changes, and economically attractive only when a miss costs tens of reviews. Frozen and fine-tuned CodeBERT scorers replicate these findings, and expose a formatting shortcut in Big-Vul that makes raw-text models look valid and efficient within the dataset and unreliable beyond it. Together with a leakage audit that shows cross-dataset performance can be overstated by up to a factor of six, these results argue for reporting miss-versus-clearance curves on shift-aware splits and for treating the miss budget as a monitored, re-calibrated operational quantity.</w:t>
+        <w:t xml:space="preserve">We asked when an automated vulnerability detector can be trusted to clear code. Framing clearance as risk control gives a precise answer: it can be trusted to the extent that the miss rate was calibrated on data that resembles the code it will see. On exchangeable splits conformal clearance delivers its guarantee on real detector scores, clearing 54–55% of functions at a 10% miss budget. Under project, temporal and cross-dataset shift the same procedure misses 2.7× the nominal share on average, covariate-shift weighting repairs it only in some scenarios, and about 100 labelled target positives do, at roughly half of the automation; adaptive conformal inference achieves the same long-run control on drifting streams when the outcomes of every vulnerable function are revealed after each batch. The guarantee is also uneven across function sizes and vulnerability classes, sensitive to cosmetic code changes, and economically attractive only when a miss costs tens of reviews. Frozen and fine-tuned CodeBERT scorers replicate these findings, and raw-text CodeBERT additionally exposes a formatting shortcut in Big-Vul that makes such models look valid and efficient within the dataset and unreliable beyond it. Together with a leakage audit that shows cross-dataset performance can be overstated by up to a factor of six, these results argue for reporting miss-versus-clearance curves on shift-aware splits and for treating the miss budget as a monitored, re-calibrated operational quantity.</w:t>
       </w:r>
     </w:p>
     <w:p>
@@ -52599,7 +53037,7 @@
         <w:pStyle w:val="BodyText"/>
       </w:pPr>
       <w:r>
-        <w:t xml:space="preserve">Future work will repeat the study with fine-tuned code language models and large language models (we fine-tuned only CodeBERT, on one or two seeds), evaluate adaptive (online) conformal variants and better density-ratio estimators for shift, extend the analysis to other programming languages and to repository-level detection, and apply the same risk-control formulation to other automation decisions in the software supply chain.</w:t>
+        <w:t xml:space="preserve">Future work will repeat the study with fine-tuned code language models and large language models (we fine-tuned only CodeBERT, on one or two seeds), evaluate online conformal variants under partial and slow discovery of missed vulnerabilities and better density-ratio estimators for shift, extend the analysis to other programming languages and to repository-level detection, and apply the same risk-control formulation to other automation decisions in the software supply chain.</w:t>
       </w:r>
     </w:p>
     <w:bookmarkEnd w:id="91"/>

</xml_diff>